<commit_message>
chore(templates): update all 4 agreement templates (repo sync with R2)
</commit_message>
<xml_diff>
--- a/backend/templates-src/employment-agreement-fr.docx
+++ b/backend/templates-src/employment-agreement-fr.docx
@@ -777,29 +777,7 @@
           <w:sz w:val="22"/>
           <w:szCs w:val="22"/>
         </w:rPr>
-        <w:t xml:space="preserve">Pendant la durée de votre emploi et à tout moment par la suite, les Informations confidentielles seront conservées par vous dans la plus stricte confidentialité et ne seront pas, sans le consentement écrit préalable de la Société, divulguées, pour quelque raison ou objectif que ce soit, à toute personne ou entité autre que dans le cadre de votre emploi par la Société. Vous prendrez toutes les précautions nécessaires et diligentes pour protéger l’intégrité et la confidentialité des Informations confidentielles et pour les garder confidentielles, qu’elles soient sous forme écrite, orale ou sur support électronique. Vous acceptez que vous </w:t>
-      </w:r>
-      <w:proofErr w:type="gramStart"/>
-      <w:r>
-        <w:rPr>
-          <w:rFonts w:ascii="Book Antiqua" w:eastAsia="Book Antiqua" w:hAnsi="Book Antiqua" w:cs="Book Antiqua"/>
-          <w:bCs/>
-          <w:color w:val="000000"/>
-          <w:sz w:val="22"/>
-          <w:szCs w:val="22"/>
-        </w:rPr>
-        <w:t>n’acquerrez</w:t>
-      </w:r>
-      <w:proofErr w:type="gramEnd"/>
-      <w:r>
-        <w:rPr>
-          <w:rFonts w:ascii="Book Antiqua" w:eastAsia="Book Antiqua" w:hAnsi="Book Antiqua" w:cs="Book Antiqua"/>
-          <w:bCs/>
-          <w:color w:val="000000"/>
-          <w:sz w:val="22"/>
-          <w:szCs w:val="22"/>
-        </w:rPr>
-        <w:t xml:space="preserve"> aucun droit, titre ou intérêt sur les Informations confidentielles.</w:t>
+        <w:t>Pendant la durée de votre emploi et à tout moment par la suite, les Informations confidentielles seront conservées par vous dans la plus stricte confidentialité et ne seront pas, sans le consentement écrit préalable de la Société, divulguées, pour quelque raison ou objectif que ce soit, à toute personne ou entité autre que dans le cadre de votre emploi par la Société. Vous prendrez toutes les précautions nécessaires et diligentes pour protéger l’intégrité et la confidentialité des Informations confidentielles et pour les garder confidentielles, qu’elles soient sous forme écrite, orale ou sur support électronique. Vous acceptez que vous n’acquerrez aucun droit, titre ou intérêt sur les Informations confidentielles.</w:t>
       </w:r>
     </w:p>
     <w:p>
@@ -866,7 +844,6 @@
         </w:rPr>
         <w:t xml:space="preserve">Tous les droits, titres et intérêts sur tous les résultats et produits du travail que vous produisez dans le cadre de votre emploi ou de votre engagement auprès de la Société, y compris les logiciels, le matériel, le savoir-faire, les dessins, les techniques, la documentation, les essais, les données de performance, les procédés, les méthodes de production et autres éléments et améliorations apportées à ces biens, quel que soit la forme ou le support sur lequel ils sont stockés, dont une partie ou la totalité peuvent être protégés par des brevets, des droits d’auteur, des secrets commerciaux, des marques de commerce, des dessins industriels ou des topographies de circuits intégrés ou tout autre droit de Common Law ou statutaire partout dans le monde (la « Propriété intellectuelle »), appartiennent à la Société, et vous n’avez aucun droit sur cette Propriété intellectuelle. Il est entendu que tous les droits, titres et intérêts (y compris tout droit de propriété intellectuelle et tout droit « moral ») sur toute Propriété intellectuelle que vous pourriez acquérir dans le cadre de votre emploi ou de votre engagement auprès de la Société, y compris avant la signature de la présente Offre, sont cédés à la Société. En outre, vous renoncez par les présentes à tout droit moral que vous pourriez avoir, aurez ou aviez sur toute Propriété intellectuelle. À la demande et aux frais de la Société, pendant et après votre emploi ou votre engagement auprès de la Société, vous devrez accomplir tous les actes nécessaires et signer tous les documents nécessaires afin de céder et de renoncer à tous les droits, titres et intérêts sur la Propriété intellectuelle en faveur de la Société et pour permettre à la Société d’enregistrer des brevets, des droits d’auteur, des marques de </w:t>
       </w:r>
-      <w:proofErr w:type="gramStart"/>
       <w:r>
         <w:rPr>
           <w:rFonts w:ascii="Book Antiqua" w:eastAsia="Book Antiqua" w:hAnsi="Book Antiqua" w:cs="Book Antiqua"/>
@@ -875,17 +852,7 @@
           <w:szCs w:val="22"/>
         </w:rPr>
         <w:lastRenderedPageBreak/>
-        <w:t>commerce</w:t>
-      </w:r>
-      <w:proofErr w:type="gramEnd"/>
-      <w:r>
-        <w:rPr>
-          <w:rFonts w:ascii="Book Antiqua" w:eastAsia="Book Antiqua" w:hAnsi="Book Antiqua" w:cs="Book Antiqua"/>
-          <w:color w:val="000000"/>
-          <w:sz w:val="22"/>
-          <w:szCs w:val="22"/>
-        </w:rPr>
-        <w:t>, des topographies de circuits intégrés, des dessins industriels et toute autre protection que la Société juge souhaitable, partout dans le monde.</w:t>
+        <w:t>commerce, des topographies de circuits intégrés, des dessins industriels et toute autre protection que la Société juge souhaitable, partout dans le monde.</w:t>
       </w:r>
     </w:p>
     <w:p>
@@ -995,37 +962,15 @@
           <w:szCs w:val="22"/>
         </w:rPr>
       </w:pPr>
-      <w:proofErr w:type="gramStart"/>
-      <w:r>
-        <w:rPr>
-          <w:rFonts w:ascii="Book Antiqua" w:eastAsia="Book Antiqua" w:hAnsi="Book Antiqua" w:cs="Book Antiqua"/>
-          <w:color w:val="000000"/>
-          <w:sz w:val="22"/>
-          <w:szCs w:val="22"/>
-        </w:rPr>
-        <w:t>influencer</w:t>
-      </w:r>
-      <w:proofErr w:type="gramEnd"/>
-      <w:r>
-        <w:rPr>
-          <w:rFonts w:ascii="Book Antiqua" w:eastAsia="Book Antiqua" w:hAnsi="Book Antiqua" w:cs="Book Antiqua"/>
-          <w:color w:val="000000"/>
-          <w:sz w:val="22"/>
-          <w:szCs w:val="22"/>
-        </w:rPr>
-        <w:t xml:space="preserve"> ou tenter d’influencer la décision de tout Client protégé d’acheter, de louer ou d’acquérir de toute autre manière une entreprise, un produit, un service ou toute autre chose en concurrence avec l’entreprise de la Société, ou la décision d’annuler tout arrangement ou accord avec la Société, ou d’aider d’autres personnes à influencer de telles décisions des Clients protégés, sauf par le biais d’une publicité générale destinée au public; </w:t>
-      </w:r>
-      <w:proofErr w:type="gramStart"/>
-      <w:r>
-        <w:rPr>
-          <w:rFonts w:ascii="Book Antiqua" w:eastAsia="Book Antiqua" w:hAnsi="Book Antiqua" w:cs="Book Antiqua"/>
-          <w:color w:val="000000"/>
-          <w:sz w:val="22"/>
-          <w:szCs w:val="22"/>
-        </w:rPr>
-        <w:t>ou</w:t>
-      </w:r>
-      <w:proofErr w:type="gramEnd"/>
+      <w:r>
+        <w:rPr>
+          <w:rFonts w:ascii="Book Antiqua" w:eastAsia="Book Antiqua" w:hAnsi="Book Antiqua" w:cs="Book Antiqua"/>
+          <w:color w:val="000000"/>
+          <w:sz w:val="22"/>
+          <w:szCs w:val="22"/>
+        </w:rPr>
+        <w:t>influencer ou tenter d’influencer la décision de tout Client protégé d’acheter, de louer ou d’acquérir de toute autre manière une entreprise, un produit, un service ou toute autre chose en concurrence avec l’entreprise de la Société, ou la décision d’annuler tout arrangement ou accord avec la Société, ou d’aider d’autres personnes à influencer de telles décisions des Clients protégés, sauf par le biais d’une publicité générale destinée au public; ou</w:t>
+      </w:r>
     </w:p>
     <w:p>
       <w:pPr>
@@ -1540,7 +1485,7 @@
           <w:sz w:val="22"/>
           <w:szCs w:val="22"/>
         </w:rPr>
-        <w:t>[Titre de la personne ci-dessus]</w:t>
+        <w:t>Signataire autorisé</w:t>
       </w:r>
     </w:p>
     <w:p>

</xml_diff>